<commit_message>
chore: add .gitattributes and normalize line endings
</commit_message>
<xml_diff>
--- a/智能网联汽车技术/chaoxing/实验/实验五/实验五(通讯建模基础)报告模板.docx
+++ b/智能网联汽车技术/chaoxing/实验/实验五/实验五(通讯建模基础)报告模板.docx
@@ -1,11 +1,12 @@
 
 <file path=word/document.xml><?xml version="1.0" encoding="utf-8"?>
-<w:document xmlns:wpc="http://schemas.microsoft.com/office/word/2010/wordprocessingCanvas" xmlns:cx="http://schemas.microsoft.com/office/drawing/2014/chartex" xmlns:cx1="http://schemas.microsoft.com/office/drawing/2015/9/8/chartex" xmlns:cx2="http://schemas.microsoft.com/office/drawing/2015/10/21/chartex" xmlns:cx3="http://schemas.microsoft.com/office/drawing/2016/5/9/chartex" xmlns:cx4="http://schemas.microsoft.com/office/drawing/2016/5/10/chartex" xmlns:cx5="http://schemas.microsoft.com/office/drawing/2016/5/11/chartex" xmlns:cx6="http://schemas.microsoft.com/office/drawing/2016/5/12/chartex" xmlns:cx7="http://schemas.microsoft.com/office/drawing/2016/5/13/chartex" xmlns:cx8="http://schemas.microsoft.com/office/drawing/2016/5/14/chartex" xmlns:mc="http://schemas.openxmlformats.org/markup-compatibility/2006" xmlns:aink="http://schemas.microsoft.com/office/drawing/2016/ink" xmlns:am3d="http://schemas.microsoft.com/office/drawing/2017/model3d" xmlns:o="urn:schemas-microsoft-com:office:office" xmlns:r="http://schemas.openxmlformats.org/officeDocument/2006/relationships" xmlns:m="http://schemas.openxmlformats.org/officeDocument/2006/math" xmlns:v="urn:schemas-microsoft-com:vml" xmlns:wp14="http://schemas.microsoft.com/office/word/2010/wordprocessingDrawing" xmlns:wp="http://schemas.openxmlformats.org/drawingml/2006/wordprocessingDrawing" xmlns:w10="urn:schemas-microsoft-com:office:word" xmlns:w="http://schemas.openxmlformats.org/wordprocessingml/2006/main" xmlns:w14="http://schemas.microsoft.com/office/word/2010/wordml" xmlns:w15="http://schemas.microsoft.com/office/word/2012/wordml" xmlns:w16cex="http://schemas.microsoft.com/office/word/2018/wordml/cex" xmlns:w16cid="http://schemas.microsoft.com/office/word/2016/wordml/cid" xmlns:w16="http://schemas.microsoft.com/office/word/2018/wordml" xmlns:w16sdtdh="http://schemas.microsoft.com/office/word/2020/wordml/sdtdatahash" xmlns:w16se="http://schemas.microsoft.com/office/word/2015/wordml/symex" xmlns:wpg="http://schemas.microsoft.com/office/word/2010/wordprocessingGroup" xmlns:wpi="http://schemas.microsoft.com/office/word/2010/wordprocessingInk" xmlns:wne="http://schemas.microsoft.com/office/word/2006/wordml" xmlns:wps="http://schemas.microsoft.com/office/word/2010/wordprocessingShape" mc:Ignorable="w14 w15 w16se w16cid w16 w16cex w16sdtdh wp14">
+<w:document xmlns:wpc="http://schemas.microsoft.com/office/word/2010/wordprocessingCanvas" xmlns:cx="http://schemas.microsoft.com/office/drawing/2014/chartex" xmlns:cx1="http://schemas.microsoft.com/office/drawing/2015/9/8/chartex" xmlns:cx2="http://schemas.microsoft.com/office/drawing/2015/10/21/chartex" xmlns:cx3="http://schemas.microsoft.com/office/drawing/2016/5/9/chartex" xmlns:cx4="http://schemas.microsoft.com/office/drawing/2016/5/10/chartex" xmlns:cx5="http://schemas.microsoft.com/office/drawing/2016/5/11/chartex" xmlns:cx6="http://schemas.microsoft.com/office/drawing/2016/5/12/chartex" xmlns:cx7="http://schemas.microsoft.com/office/drawing/2016/5/13/chartex" xmlns:cx8="http://schemas.microsoft.com/office/drawing/2016/5/14/chartex" xmlns:mc="http://schemas.openxmlformats.org/markup-compatibility/2006" xmlns:aink="http://schemas.microsoft.com/office/drawing/2016/ink" xmlns:am3d="http://schemas.microsoft.com/office/drawing/2017/model3d" xmlns:o="urn:schemas-microsoft-com:office:office" xmlns:oel="http://schemas.microsoft.com/office/2019/extlst" xmlns:r="http://schemas.openxmlformats.org/officeDocument/2006/relationships" xmlns:m="http://schemas.openxmlformats.org/officeDocument/2006/math" xmlns:v="urn:schemas-microsoft-com:vml" xmlns:wp14="http://schemas.microsoft.com/office/word/2010/wordprocessingDrawing" xmlns:wp="http://schemas.openxmlformats.org/drawingml/2006/wordprocessingDrawing" xmlns:w10="urn:schemas-microsoft-com:office:word" xmlns:w="http://schemas.openxmlformats.org/wordprocessingml/2006/main" xmlns:w14="http://schemas.microsoft.com/office/word/2010/wordml" xmlns:w15="http://schemas.microsoft.com/office/word/2012/wordml" xmlns:w16cex="http://schemas.microsoft.com/office/word/2018/wordml/cex" xmlns:w16cid="http://schemas.microsoft.com/office/word/2016/wordml/cid" xmlns:w16="http://schemas.microsoft.com/office/word/2018/wordml" xmlns:w16du="http://schemas.microsoft.com/office/word/2023/wordml/word16du" xmlns:w16sdtdh="http://schemas.microsoft.com/office/word/2020/wordml/sdtdatahash" xmlns:w16sdtfl="http://schemas.microsoft.com/office/word/2024/wordml/sdtformatlock" xmlns:w16se="http://schemas.microsoft.com/office/word/2015/wordml/symex" xmlns:wpg="http://schemas.microsoft.com/office/word/2010/wordprocessingGroup" xmlns:wpi="http://schemas.microsoft.com/office/word/2010/wordprocessingInk" xmlns:wne="http://schemas.microsoft.com/office/word/2006/wordml" xmlns:wps="http://schemas.microsoft.com/office/word/2010/wordprocessingShape" mc:Ignorable="w14 w15 w16se w16cid w16 w16cex w16sdtdh w16sdtfl w16du wp14">
   <w:body>
     <w:p>
       <w:pPr>
         <w:jc w:val="center"/>
         <w:rPr>
+          <w:rFonts w:hint="eastAsia"/>
           <w:b/>
           <w:bCs/>
           <w:sz w:val="24"/>
@@ -63,10 +64,17 @@
         <w:t>通讯建模</w:t>
       </w:r>
     </w:p>
-    <w:p/>
-    <w:p>
-      <w:pPr>
-        <w:rPr>
+    <w:p>
+      <w:pPr>
+        <w:rPr>
+          <w:rFonts w:hint="eastAsia"/>
+        </w:rPr>
+      </w:pPr>
+    </w:p>
+    <w:p>
+      <w:pPr>
+        <w:rPr>
+          <w:rFonts w:hint="eastAsia"/>
           <w:b/>
           <w:bCs/>
           <w:szCs w:val="21"/>
@@ -83,6 +91,11 @@
       </w:r>
     </w:p>
     <w:p>
+      <w:pPr>
+        <w:rPr>
+          <w:rFonts w:hint="eastAsia"/>
+        </w:rPr>
+      </w:pPr>
       <w:r>
         <w:tab/>
         <w:t>1</w:t>
@@ -164,6 +177,11 @@
       </w:r>
     </w:p>
     <w:p>
+      <w:pPr>
+        <w:rPr>
+          <w:rFonts w:hint="eastAsia"/>
+        </w:rPr>
+      </w:pPr>
       <w:r>
         <w:tab/>
         <w:t>2</w:t>
@@ -229,10 +247,17 @@
         <w:t>。</w:t>
       </w:r>
     </w:p>
-    <w:p/>
-    <w:p>
-      <w:pPr>
-        <w:rPr>
+    <w:p>
+      <w:pPr>
+        <w:rPr>
+          <w:rFonts w:hint="eastAsia"/>
+        </w:rPr>
+      </w:pPr>
+    </w:p>
+    <w:p>
+      <w:pPr>
+        <w:rPr>
+          <w:rFonts w:hint="eastAsia"/>
           <w:b/>
           <w:bCs/>
           <w:szCs w:val="21"/>
@@ -267,6 +292,9 @@
     <w:p>
       <w:pPr>
         <w:ind w:firstLineChars="200" w:firstLine="420"/>
+        <w:rPr>
+          <w:rFonts w:hint="eastAsia"/>
+        </w:rPr>
       </w:pPr>
       <w:r>
         <w:rPr>
@@ -278,11 +306,15 @@
     <w:p>
       <w:pPr>
         <w:ind w:firstLineChars="200" w:firstLine="420"/>
-      </w:pPr>
-    </w:p>
-    <w:p>
-      <w:pPr>
-        <w:rPr>
+        <w:rPr>
+          <w:rFonts w:hint="eastAsia"/>
+        </w:rPr>
+      </w:pPr>
+    </w:p>
+    <w:p>
+      <w:pPr>
+        <w:rPr>
+          <w:rFonts w:hint="eastAsia"/>
           <w:b/>
           <w:bCs/>
           <w:szCs w:val="21"/>
@@ -315,6 +347,11 @@
       </w:r>
     </w:p>
     <w:p>
+      <w:pPr>
+        <w:rPr>
+          <w:rFonts w:hint="eastAsia"/>
+        </w:rPr>
+      </w:pPr>
       <w:r>
         <w:rPr>
           <w:b/>
@@ -351,6 +388,11 @@
       </w:r>
     </w:p>
     <w:p>
+      <w:pPr>
+        <w:rPr>
+          <w:rFonts w:hint="eastAsia"/>
+        </w:rPr>
+      </w:pPr>
       <w:r>
         <w:rPr>
           <w:szCs w:val="21"/>
@@ -361,6 +403,7 @@
     <w:p>
       <w:pPr>
         <w:rPr>
+          <w:rFonts w:hint="eastAsia"/>
           <w:b/>
           <w:bCs/>
           <w:szCs w:val="21"/>
@@ -395,6 +438,11 @@
       </w:r>
     </w:p>
     <w:p>
+      <w:pPr>
+        <w:rPr>
+          <w:rFonts w:hint="eastAsia"/>
+        </w:rPr>
+      </w:pPr>
       <w:r>
         <w:tab/>
       </w:r>
@@ -453,10 +501,17 @@
         <w:t>。</w:t>
       </w:r>
     </w:p>
-    <w:p/>
-    <w:p>
-      <w:pPr>
-        <w:rPr>
+    <w:p>
+      <w:pPr>
+        <w:rPr>
+          <w:rFonts w:hint="eastAsia"/>
+        </w:rPr>
+      </w:pPr>
+    </w:p>
+    <w:p>
+      <w:pPr>
+        <w:rPr>
+          <w:rFonts w:hint="eastAsia"/>
           <w:b/>
           <w:bCs/>
           <w:szCs w:val="21"/>
@@ -491,6 +546,7 @@
     <w:p>
       <w:pPr>
         <w:rPr>
+          <w:rFonts w:hint="eastAsia"/>
           <w:b/>
           <w:bCs/>
         </w:rPr>
@@ -536,6 +592,9 @@
     <w:p>
       <w:pPr>
         <w:ind w:firstLineChars="200" w:firstLine="420"/>
+        <w:rPr>
+          <w:rFonts w:hint="eastAsia"/>
+        </w:rPr>
       </w:pPr>
       <w:r>
         <w:rPr>
@@ -550,6 +609,9 @@
     <w:p>
       <w:pPr>
         <w:ind w:firstLineChars="200" w:firstLine="420"/>
+        <w:rPr>
+          <w:rFonts w:hint="eastAsia"/>
+        </w:rPr>
       </w:pPr>
       <w:r>
         <w:rPr>
@@ -580,12 +642,18 @@
       <w:pPr>
         <w:ind w:firstLineChars="200" w:firstLine="420"/>
         <w:jc w:val="center"/>
+        <w:rPr>
+          <w:rFonts w:hint="eastAsia"/>
+        </w:rPr>
       </w:pPr>
     </w:p>
     <w:p>
       <w:pPr>
         <w:ind w:firstLineChars="200" w:firstLine="420"/>
         <w:jc w:val="center"/>
+        <w:rPr>
+          <w:rFonts w:hint="eastAsia"/>
+        </w:rPr>
       </w:pPr>
     </w:p>
     <w:p>
@@ -601,6 +669,7 @@
       <w:pPr>
         <w:ind w:firstLineChars="200" w:firstLine="420"/>
         <w:rPr>
+          <w:rFonts w:hint="eastAsia"/>
           <w:i/>
           <w:color w:val="0070C0"/>
         </w:rPr>
@@ -639,6 +708,9 @@
     <w:p>
       <w:pPr>
         <w:ind w:firstLineChars="200" w:firstLine="420"/>
+        <w:rPr>
+          <w:rFonts w:hint="eastAsia"/>
+        </w:rPr>
       </w:pPr>
       <w:r>
         <w:rPr>
@@ -681,6 +753,9 @@
       <w:pPr>
         <w:ind w:firstLine="420"/>
         <w:jc w:val="center"/>
+        <w:rPr>
+          <w:rFonts w:hint="eastAsia"/>
+        </w:rPr>
       </w:pPr>
       <w:r>
         <w:rPr>
@@ -727,6 +802,9 @@
       <w:pPr>
         <w:ind w:firstLine="420"/>
         <w:jc w:val="center"/>
+        <w:rPr>
+          <w:rFonts w:hint="eastAsia"/>
+        </w:rPr>
       </w:pPr>
       <w:r>
         <w:rPr>
@@ -759,6 +837,9 @@
     <w:p>
       <w:pPr>
         <w:ind w:firstLine="420"/>
+        <w:rPr>
+          <w:rFonts w:hint="eastAsia"/>
+        </w:rPr>
       </w:pPr>
       <w:r>
         <w:rPr>
@@ -801,8 +882,8 @@
         <w:tblLook w:val="04A0" w:firstRow="1" w:lastRow="0" w:firstColumn="1" w:lastColumn="0" w:noHBand="0" w:noVBand="1"/>
       </w:tblPr>
       <w:tblGrid>
-        <w:gridCol w:w="4148"/>
-        <w:gridCol w:w="4148"/>
+        <w:gridCol w:w="3910"/>
+        <w:gridCol w:w="4386"/>
       </w:tblGrid>
       <w:tr>
         <w:tc>
@@ -871,6 +952,46 @@
                 <w:rFonts w:hint="eastAsia"/>
               </w:rPr>
             </w:pPr>
+            <w:r>
+              <w:rPr>
+                <w:noProof/>
+              </w:rPr>
+              <w:drawing>
+                <wp:inline distT="0" distB="0" distL="0" distR="0" wp14:anchorId="08E7AA55" wp14:editId="75BCBDA6">
+                  <wp:extent cx="2263613" cy="1893521"/>
+                  <wp:effectExtent l="0" t="0" r="3810" b="0"/>
+                  <wp:docPr id="158258814" name="图片 1"/>
+                  <wp:cNvGraphicFramePr>
+                    <a:graphicFrameLocks xmlns:a="http://schemas.openxmlformats.org/drawingml/2006/main" noChangeAspect="1"/>
+                  </wp:cNvGraphicFramePr>
+                  <a:graphic xmlns:a="http://schemas.openxmlformats.org/drawingml/2006/main">
+                    <a:graphicData uri="http://schemas.openxmlformats.org/drawingml/2006/picture">
+                      <pic:pic xmlns:pic="http://schemas.openxmlformats.org/drawingml/2006/picture">
+                        <pic:nvPicPr>
+                          <pic:cNvPr id="158258814" name=""/>
+                          <pic:cNvPicPr/>
+                        </pic:nvPicPr>
+                        <pic:blipFill>
+                          <a:blip r:embed="rId8"/>
+                          <a:stretch>
+                            <a:fillRect/>
+                          </a:stretch>
+                        </pic:blipFill>
+                        <pic:spPr>
+                          <a:xfrm>
+                            <a:off x="0" y="0"/>
+                            <a:ext cx="2292518" cy="1917700"/>
+                          </a:xfrm>
+                          <a:prstGeom prst="rect">
+                            <a:avLst/>
+                          </a:prstGeom>
+                        </pic:spPr>
+                      </pic:pic>
+                    </a:graphicData>
+                  </a:graphic>
+                </wp:inline>
+              </w:drawing>
+            </w:r>
           </w:p>
         </w:tc>
         <w:tc>
@@ -883,6 +1004,46 @@
                 <w:rFonts w:hint="eastAsia"/>
               </w:rPr>
             </w:pPr>
+            <w:r>
+              <w:rPr>
+                <w:noProof/>
+              </w:rPr>
+              <w:drawing>
+                <wp:inline distT="0" distB="0" distL="0" distR="0" wp14:anchorId="49DD90F0" wp14:editId="74CF48EA">
+                  <wp:extent cx="2643229" cy="1745817"/>
+                  <wp:effectExtent l="0" t="0" r="5080" b="6985"/>
+                  <wp:docPr id="1045194575" name="图片 1"/>
+                  <wp:cNvGraphicFramePr>
+                    <a:graphicFrameLocks xmlns:a="http://schemas.openxmlformats.org/drawingml/2006/main" noChangeAspect="1"/>
+                  </wp:cNvGraphicFramePr>
+                  <a:graphic xmlns:a="http://schemas.openxmlformats.org/drawingml/2006/main">
+                    <a:graphicData uri="http://schemas.openxmlformats.org/drawingml/2006/picture">
+                      <pic:pic xmlns:pic="http://schemas.openxmlformats.org/drawingml/2006/picture">
+                        <pic:nvPicPr>
+                          <pic:cNvPr id="1045194575" name=""/>
+                          <pic:cNvPicPr/>
+                        </pic:nvPicPr>
+                        <pic:blipFill>
+                          <a:blip r:embed="rId9"/>
+                          <a:stretch>
+                            <a:fillRect/>
+                          </a:stretch>
+                        </pic:blipFill>
+                        <pic:spPr>
+                          <a:xfrm>
+                            <a:off x="0" y="0"/>
+                            <a:ext cx="2656714" cy="1754724"/>
+                          </a:xfrm>
+                          <a:prstGeom prst="rect">
+                            <a:avLst/>
+                          </a:prstGeom>
+                        </pic:spPr>
+                      </pic:pic>
+                    </a:graphicData>
+                  </a:graphic>
+                </wp:inline>
+              </w:drawing>
+            </w:r>
           </w:p>
         </w:tc>
       </w:tr>
@@ -897,6 +1058,7 @@
     <w:p>
       <w:pPr>
         <w:rPr>
+          <w:rFonts w:hint="eastAsia"/>
           <w:b/>
           <w:bCs/>
         </w:rPr>
@@ -944,6 +1106,9 @@
     <w:p>
       <w:pPr>
         <w:ind w:firstLine="420"/>
+        <w:rPr>
+          <w:rFonts w:hint="eastAsia"/>
+        </w:rPr>
       </w:pPr>
       <w:r>
         <w:rPr>
@@ -1004,6 +1169,9 @@
       <w:pPr>
         <w:ind w:firstLine="420"/>
         <w:jc w:val="center"/>
+        <w:rPr>
+          <w:rFonts w:hint="eastAsia"/>
+        </w:rPr>
       </w:pPr>
       <w:r>
         <w:rPr>
@@ -1025,7 +1193,7 @@
                     <pic:cNvPicPr/>
                   </pic:nvPicPr>
                   <pic:blipFill>
-                    <a:blip r:embed="rId8"/>
+                    <a:blip r:embed="rId10"/>
                     <a:stretch>
                       <a:fillRect/>
                     </a:stretch>
@@ -1050,6 +1218,9 @@
       <w:pPr>
         <w:ind w:firstLine="420"/>
         <w:jc w:val="center"/>
+        <w:rPr>
+          <w:rFonts w:hint="eastAsia"/>
+        </w:rPr>
       </w:pPr>
       <w:r>
         <w:rPr>
@@ -1071,6 +1242,11 @@
       </w:r>
     </w:p>
     <w:p>
+      <w:pPr>
+        <w:rPr>
+          <w:rFonts w:hint="eastAsia"/>
+        </w:rPr>
+      </w:pPr>
       <w:r>
         <w:rPr>
           <w:rFonts w:hint="eastAsia"/>
@@ -1084,6 +1260,9 @@
     <w:p>
       <w:pPr>
         <w:ind w:firstLine="420"/>
+        <w:rPr>
+          <w:rFonts w:hint="eastAsia"/>
+        </w:rPr>
       </w:pPr>
       <w:r>
         <w:rPr>
@@ -1104,11 +1283,17 @@
     <w:p>
       <w:pPr>
         <w:ind w:firstLine="420"/>
+        <w:rPr>
+          <w:rFonts w:hint="eastAsia"/>
+        </w:rPr>
       </w:pPr>
     </w:p>
     <w:p>
       <w:pPr>
         <w:ind w:firstLine="420"/>
+        <w:rPr>
+          <w:rFonts w:hint="eastAsia"/>
+        </w:rPr>
       </w:pPr>
       <w:r>
         <w:rPr>
@@ -1133,8 +1318,8 @@
         <w:tblLook w:val="04A0" w:firstRow="1" w:lastRow="0" w:firstColumn="1" w:lastColumn="0" w:noHBand="0" w:noVBand="1"/>
       </w:tblPr>
       <w:tblGrid>
-        <w:gridCol w:w="4217"/>
-        <w:gridCol w:w="4079"/>
+        <w:gridCol w:w="3962"/>
+        <w:gridCol w:w="4334"/>
       </w:tblGrid>
       <w:tr>
         <w:tc>
@@ -1190,6 +1375,46 @@
                 <w:rFonts w:hint="eastAsia"/>
               </w:rPr>
             </w:pPr>
+            <w:r>
+              <w:rPr>
+                <w:noProof/>
+              </w:rPr>
+              <w:drawing>
+                <wp:inline distT="0" distB="0" distL="0" distR="0" wp14:anchorId="25ADB464" wp14:editId="57CDC9FB">
+                  <wp:extent cx="2379817" cy="1582438"/>
+                  <wp:effectExtent l="0" t="0" r="1905" b="0"/>
+                  <wp:docPr id="713148020" name="图片 1"/>
+                  <wp:cNvGraphicFramePr>
+                    <a:graphicFrameLocks xmlns:a="http://schemas.openxmlformats.org/drawingml/2006/main" noChangeAspect="1"/>
+                  </wp:cNvGraphicFramePr>
+                  <a:graphic xmlns:a="http://schemas.openxmlformats.org/drawingml/2006/main">
+                    <a:graphicData uri="http://schemas.openxmlformats.org/drawingml/2006/picture">
+                      <pic:pic xmlns:pic="http://schemas.openxmlformats.org/drawingml/2006/picture">
+                        <pic:nvPicPr>
+                          <pic:cNvPr id="713148020" name=""/>
+                          <pic:cNvPicPr/>
+                        </pic:nvPicPr>
+                        <pic:blipFill>
+                          <a:blip r:embed="rId11"/>
+                          <a:stretch>
+                            <a:fillRect/>
+                          </a:stretch>
+                        </pic:blipFill>
+                        <pic:spPr>
+                          <a:xfrm>
+                            <a:off x="0" y="0"/>
+                            <a:ext cx="2412066" cy="1603882"/>
+                          </a:xfrm>
+                          <a:prstGeom prst="rect">
+                            <a:avLst/>
+                          </a:prstGeom>
+                        </pic:spPr>
+                      </pic:pic>
+                    </a:graphicData>
+                  </a:graphic>
+                </wp:inline>
+              </w:drawing>
+            </w:r>
           </w:p>
         </w:tc>
         <w:tc>
@@ -1202,12 +1427,63 @@
                 <w:rFonts w:hint="eastAsia"/>
               </w:rPr>
             </w:pPr>
+            <w:r>
+              <w:rPr>
+                <w:noProof/>
+              </w:rPr>
+              <w:drawing>
+                <wp:inline distT="0" distB="0" distL="0" distR="0" wp14:anchorId="3AFCD6D1" wp14:editId="6041EE66">
+                  <wp:extent cx="2617524" cy="1236910"/>
+                  <wp:effectExtent l="0" t="0" r="0" b="1905"/>
+                  <wp:docPr id="381072183" name="图片 1"/>
+                  <wp:cNvGraphicFramePr>
+                    <a:graphicFrameLocks xmlns:a="http://schemas.openxmlformats.org/drawingml/2006/main" noChangeAspect="1"/>
+                  </wp:cNvGraphicFramePr>
+                  <a:graphic xmlns:a="http://schemas.openxmlformats.org/drawingml/2006/main">
+                    <a:graphicData uri="http://schemas.openxmlformats.org/drawingml/2006/picture">
+                      <pic:pic xmlns:pic="http://schemas.openxmlformats.org/drawingml/2006/picture">
+                        <pic:nvPicPr>
+                          <pic:cNvPr id="381072183" name=""/>
+                          <pic:cNvPicPr/>
+                        </pic:nvPicPr>
+                        <pic:blipFill>
+                          <a:blip r:embed="rId12"/>
+                          <a:stretch>
+                            <a:fillRect/>
+                          </a:stretch>
+                        </pic:blipFill>
+                        <pic:spPr>
+                          <a:xfrm>
+                            <a:off x="0" y="0"/>
+                            <a:ext cx="2654678" cy="1254467"/>
+                          </a:xfrm>
+                          <a:prstGeom prst="rect">
+                            <a:avLst/>
+                          </a:prstGeom>
+                        </pic:spPr>
+                      </pic:pic>
+                    </a:graphicData>
+                  </a:graphic>
+                </wp:inline>
+              </w:drawing>
+            </w:r>
           </w:p>
         </w:tc>
       </w:tr>
     </w:tbl>
-    <w:p/>
-    <w:p>
+    <w:p>
+      <w:pPr>
+        <w:rPr>
+          <w:rFonts w:hint="eastAsia"/>
+        </w:rPr>
+      </w:pPr>
+    </w:p>
+    <w:p>
+      <w:pPr>
+        <w:rPr>
+          <w:rFonts w:hint="eastAsia"/>
+        </w:rPr>
+      </w:pPr>
       <w:r>
         <w:rPr>
           <w:rFonts w:hint="eastAsia"/>
@@ -1274,29 +1550,68 @@
                 <w:rFonts w:hint="eastAsia"/>
               </w:rPr>
             </w:pPr>
+            <w:r>
+              <w:rPr>
+                <w:noProof/>
+              </w:rPr>
+              <w:drawing>
+                <wp:inline distT="0" distB="0" distL="0" distR="0" wp14:anchorId="5714E8F9" wp14:editId="3A463096">
+                  <wp:extent cx="4303026" cy="1612728"/>
+                  <wp:effectExtent l="0" t="0" r="2540" b="6985"/>
+                  <wp:docPr id="94088468" name="图片 1"/>
+                  <wp:cNvGraphicFramePr>
+                    <a:graphicFrameLocks xmlns:a="http://schemas.openxmlformats.org/drawingml/2006/main" noChangeAspect="1"/>
+                  </wp:cNvGraphicFramePr>
+                  <a:graphic xmlns:a="http://schemas.openxmlformats.org/drawingml/2006/main">
+                    <a:graphicData uri="http://schemas.openxmlformats.org/drawingml/2006/picture">
+                      <pic:pic xmlns:pic="http://schemas.openxmlformats.org/drawingml/2006/picture">
+                        <pic:nvPicPr>
+                          <pic:cNvPr id="94088468" name=""/>
+                          <pic:cNvPicPr/>
+                        </pic:nvPicPr>
+                        <pic:blipFill>
+                          <a:blip r:embed="rId13"/>
+                          <a:stretch>
+                            <a:fillRect/>
+                          </a:stretch>
+                        </pic:blipFill>
+                        <pic:spPr>
+                          <a:xfrm>
+                            <a:off x="0" y="0"/>
+                            <a:ext cx="4311700" cy="1615979"/>
+                          </a:xfrm>
+                          <a:prstGeom prst="rect">
+                            <a:avLst/>
+                          </a:prstGeom>
+                        </pic:spPr>
+                      </pic:pic>
+                    </a:graphicData>
+                  </a:graphic>
+                </wp:inline>
+              </w:drawing>
+            </w:r>
           </w:p>
         </w:tc>
       </w:tr>
     </w:tbl>
-    <w:p/>
-    <w:p>
-      <w:r>
-        <w:rPr>
-          <w:rFonts w:hint="eastAsia"/>
-        </w:rPr>
-        <w:t>运行结果（</w:t>
-      </w:r>
-      <w:r>
-        <w:rPr>
-          <w:rFonts w:hint="eastAsia"/>
-        </w:rPr>
-        <w:t>发送数据</w:t>
-      </w:r>
-      <w:r>
-        <w:rPr>
-          <w:rFonts w:hint="eastAsia"/>
-        </w:rPr>
-        <w:t>、接收数据）：</w:t>
+    <w:p>
+      <w:pPr>
+        <w:rPr>
+          <w:rFonts w:hint="eastAsia"/>
+        </w:rPr>
+      </w:pPr>
+    </w:p>
+    <w:p>
+      <w:pPr>
+        <w:rPr>
+          <w:rFonts w:hint="eastAsia"/>
+        </w:rPr>
+      </w:pPr>
+      <w:r>
+        <w:rPr>
+          <w:rFonts w:hint="eastAsia"/>
+        </w:rPr>
+        <w:t>运行结果（发送数据、接收数据）：</w:t>
       </w:r>
     </w:p>
     <w:tbl>
@@ -1314,17 +1629,16 @@
             <w:tcW w:w="8296" w:type="dxa"/>
           </w:tcPr>
           <w:p>
+            <w:pPr>
+              <w:rPr>
+                <w:rFonts w:hint="eastAsia"/>
+              </w:rPr>
+            </w:pPr>
             <w:r>
               <w:rPr>
                 <w:rFonts w:hint="eastAsia"/>
               </w:rPr>
-              <w:t>发送数据</w:t>
-            </w:r>
-            <w:r>
-              <w:rPr>
-                <w:rFonts w:hint="eastAsia"/>
-              </w:rPr>
-              <w:t>：</w:t>
+              <w:t>发送数据：</w:t>
             </w:r>
           </w:p>
         </w:tc>
@@ -1337,7 +1651,53 @@
           <w:tcPr>
             <w:tcW w:w="8296" w:type="dxa"/>
           </w:tcPr>
-          <w:p/>
+          <w:p>
+            <w:pPr>
+              <w:rPr>
+                <w:rFonts w:hint="eastAsia"/>
+              </w:rPr>
+            </w:pPr>
+            <w:r>
+              <w:rPr>
+                <w:noProof/>
+              </w:rPr>
+              <w:drawing>
+                <wp:inline distT="0" distB="0" distL="0" distR="0" wp14:anchorId="27CB339D" wp14:editId="59F2D53A">
+                  <wp:extent cx="4632930" cy="2611531"/>
+                  <wp:effectExtent l="0" t="0" r="0" b="0"/>
+                  <wp:docPr id="690379283" name="图片 1"/>
+                  <wp:cNvGraphicFramePr>
+                    <a:graphicFrameLocks xmlns:a="http://schemas.openxmlformats.org/drawingml/2006/main" noChangeAspect="1"/>
+                  </wp:cNvGraphicFramePr>
+                  <a:graphic xmlns:a="http://schemas.openxmlformats.org/drawingml/2006/main">
+                    <a:graphicData uri="http://schemas.openxmlformats.org/drawingml/2006/picture">
+                      <pic:pic xmlns:pic="http://schemas.openxmlformats.org/drawingml/2006/picture">
+                        <pic:nvPicPr>
+                          <pic:cNvPr id="690379283" name=""/>
+                          <pic:cNvPicPr/>
+                        </pic:nvPicPr>
+                        <pic:blipFill>
+                          <a:blip r:embed="rId14"/>
+                          <a:stretch>
+                            <a:fillRect/>
+                          </a:stretch>
+                        </pic:blipFill>
+                        <pic:spPr>
+                          <a:xfrm>
+                            <a:off x="0" y="0"/>
+                            <a:ext cx="4651005" cy="2621720"/>
+                          </a:xfrm>
+                          <a:prstGeom prst="rect">
+                            <a:avLst/>
+                          </a:prstGeom>
+                        </pic:spPr>
+                      </pic:pic>
+                    </a:graphicData>
+                  </a:graphic>
+                </wp:inline>
+              </w:drawing>
+            </w:r>
+          </w:p>
         </w:tc>
       </w:tr>
       <w:tr>
@@ -1346,6 +1706,11 @@
             <w:tcW w:w="8296" w:type="dxa"/>
           </w:tcPr>
           <w:p>
+            <w:pPr>
+              <w:rPr>
+                <w:rFonts w:hint="eastAsia"/>
+              </w:rPr>
+            </w:pPr>
             <w:r>
               <w:rPr>
                 <w:rFonts w:hint="eastAsia"/>
@@ -1363,14 +1728,68 @@
           <w:tcPr>
             <w:tcW w:w="8296" w:type="dxa"/>
           </w:tcPr>
-          <w:p/>
+          <w:p>
+            <w:pPr>
+              <w:jc w:val="center"/>
+              <w:rPr>
+                <w:rFonts w:hint="eastAsia"/>
+              </w:rPr>
+            </w:pPr>
+            <w:r>
+              <w:rPr>
+                <w:noProof/>
+              </w:rPr>
+              <w:drawing>
+                <wp:inline distT="0" distB="0" distL="0" distR="0" wp14:anchorId="3456A05B" wp14:editId="50E44736">
+                  <wp:extent cx="2771372" cy="1737029"/>
+                  <wp:effectExtent l="0" t="0" r="0" b="0"/>
+                  <wp:docPr id="540803666" name="图片 1"/>
+                  <wp:cNvGraphicFramePr>
+                    <a:graphicFrameLocks xmlns:a="http://schemas.openxmlformats.org/drawingml/2006/main" noChangeAspect="1"/>
+                  </wp:cNvGraphicFramePr>
+                  <a:graphic xmlns:a="http://schemas.openxmlformats.org/drawingml/2006/main">
+                    <a:graphicData uri="http://schemas.openxmlformats.org/drawingml/2006/picture">
+                      <pic:pic xmlns:pic="http://schemas.openxmlformats.org/drawingml/2006/picture">
+                        <pic:nvPicPr>
+                          <pic:cNvPr id="540803666" name=""/>
+                          <pic:cNvPicPr/>
+                        </pic:nvPicPr>
+                        <pic:blipFill>
+                          <a:blip r:embed="rId15"/>
+                          <a:stretch>
+                            <a:fillRect/>
+                          </a:stretch>
+                        </pic:blipFill>
+                        <pic:spPr>
+                          <a:xfrm>
+                            <a:off x="0" y="0"/>
+                            <a:ext cx="2785359" cy="1745796"/>
+                          </a:xfrm>
+                          <a:prstGeom prst="rect">
+                            <a:avLst/>
+                          </a:prstGeom>
+                        </pic:spPr>
+                      </pic:pic>
+                    </a:graphicData>
+                  </a:graphic>
+                </wp:inline>
+              </w:drawing>
+            </w:r>
+          </w:p>
         </w:tc>
       </w:tr>
     </w:tbl>
-    <w:p/>
-    <w:p>
-      <w:pPr>
-        <w:rPr>
+    <w:p>
+      <w:pPr>
+        <w:rPr>
+          <w:rFonts w:hint="eastAsia"/>
+        </w:rPr>
+      </w:pPr>
+    </w:p>
+    <w:p>
+      <w:pPr>
+        <w:rPr>
+          <w:rFonts w:hint="eastAsia"/>
           <w:b/>
           <w:bCs/>
           <w:szCs w:val="21"/>
@@ -1437,7 +1856,7 @@
       </w:pPr>
     </w:p>
     <w:sectPr>
-      <w:headerReference w:type="default" r:id="rId9"/>
+      <w:headerReference w:type="default" r:id="rId16"/>
       <w:pgSz w:w="11906" w:h="16838"/>
       <w:pgMar w:top="1440" w:right="1800" w:bottom="1440" w:left="1800" w:header="851" w:footer="992" w:gutter="0"/>
       <w:cols w:space="425"/>
@@ -1448,9 +1867,14 @@
 </file>
 
 <file path=word/endnotes.xml><?xml version="1.0" encoding="utf-8"?>
-<w:endnotes xmlns:wpc="http://schemas.microsoft.com/office/word/2010/wordprocessingCanvas" xmlns:cx="http://schemas.microsoft.com/office/drawing/2014/chartex" xmlns:cx1="http://schemas.microsoft.com/office/drawing/2015/9/8/chartex" xmlns:cx2="http://schemas.microsoft.com/office/drawing/2015/10/21/chartex" xmlns:cx3="http://schemas.microsoft.com/office/drawing/2016/5/9/chartex" xmlns:cx4="http://schemas.microsoft.com/office/drawing/2016/5/10/chartex" xmlns:cx5="http://schemas.microsoft.com/office/drawing/2016/5/11/chartex" xmlns:cx6="http://schemas.microsoft.com/office/drawing/2016/5/12/chartex" xmlns:cx7="http://schemas.microsoft.com/office/drawing/2016/5/13/chartex" xmlns:cx8="http://schemas.microsoft.com/office/drawing/2016/5/14/chartex" xmlns:mc="http://schemas.openxmlformats.org/markup-compatibility/2006" xmlns:aink="http://schemas.microsoft.com/office/drawing/2016/ink" xmlns:am3d="http://schemas.microsoft.com/office/drawing/2017/model3d" xmlns:o="urn:schemas-microsoft-com:office:office" xmlns:r="http://schemas.openxmlformats.org/officeDocument/2006/relationships" xmlns:m="http://schemas.openxmlformats.org/officeDocument/2006/math" xmlns:v="urn:schemas-microsoft-com:vml" xmlns:wp14="http://schemas.microsoft.com/office/word/2010/wordprocessingDrawing" xmlns:wp="http://schemas.openxmlformats.org/drawingml/2006/wordprocessingDrawing" xmlns:w10="urn:schemas-microsoft-com:office:word" xmlns:w="http://schemas.openxmlformats.org/wordprocessingml/2006/main" xmlns:w14="http://schemas.microsoft.com/office/word/2010/wordml" xmlns:w15="http://schemas.microsoft.com/office/word/2012/wordml" xmlns:w16cex="http://schemas.microsoft.com/office/word/2018/wordml/cex" xmlns:w16cid="http://schemas.microsoft.com/office/word/2016/wordml/cid" xmlns:w16="http://schemas.microsoft.com/office/word/2018/wordml" xmlns:w16sdtdh="http://schemas.microsoft.com/office/word/2020/wordml/sdtdatahash" xmlns:w16se="http://schemas.microsoft.com/office/word/2015/wordml/symex" xmlns:wpg="http://schemas.microsoft.com/office/word/2010/wordprocessingGroup" xmlns:wpi="http://schemas.microsoft.com/office/word/2010/wordprocessingInk" xmlns:wne="http://schemas.microsoft.com/office/word/2006/wordml" xmlns:wps="http://schemas.microsoft.com/office/word/2010/wordprocessingShape" mc:Ignorable="w14 w15 w16se w16cid w16 w16cex w16sdtdh wp14">
+<w:endnotes xmlns:wpc="http://schemas.microsoft.com/office/word/2010/wordprocessingCanvas" xmlns:cx="http://schemas.microsoft.com/office/drawing/2014/chartex" xmlns:cx1="http://schemas.microsoft.com/office/drawing/2015/9/8/chartex" xmlns:cx2="http://schemas.microsoft.com/office/drawing/2015/10/21/chartex" xmlns:cx3="http://schemas.microsoft.com/office/drawing/2016/5/9/chartex" xmlns:cx4="http://schemas.microsoft.com/office/drawing/2016/5/10/chartex" xmlns:cx5="http://schemas.microsoft.com/office/drawing/2016/5/11/chartex" xmlns:cx6="http://schemas.microsoft.com/office/drawing/2016/5/12/chartex" xmlns:cx7="http://schemas.microsoft.com/office/drawing/2016/5/13/chartex" xmlns:cx8="http://schemas.microsoft.com/office/drawing/2016/5/14/chartex" xmlns:mc="http://schemas.openxmlformats.org/markup-compatibility/2006" xmlns:aink="http://schemas.microsoft.com/office/drawing/2016/ink" xmlns:am3d="http://schemas.microsoft.com/office/drawing/2017/model3d" xmlns:o="urn:schemas-microsoft-com:office:office" xmlns:oel="http://schemas.microsoft.com/office/2019/extlst" xmlns:r="http://schemas.openxmlformats.org/officeDocument/2006/relationships" xmlns:m="http://schemas.openxmlformats.org/officeDocument/2006/math" xmlns:v="urn:schemas-microsoft-com:vml" xmlns:wp14="http://schemas.microsoft.com/office/word/2010/wordprocessingDrawing" xmlns:wp="http://schemas.openxmlformats.org/drawingml/2006/wordprocessingDrawing" xmlns:w10="urn:schemas-microsoft-com:office:word" xmlns:w="http://schemas.openxmlformats.org/wordprocessingml/2006/main" xmlns:w14="http://schemas.microsoft.com/office/word/2010/wordml" xmlns:w15="http://schemas.microsoft.com/office/word/2012/wordml" xmlns:w16cex="http://schemas.microsoft.com/office/word/2018/wordml/cex" xmlns:w16cid="http://schemas.microsoft.com/office/word/2016/wordml/cid" xmlns:w16="http://schemas.microsoft.com/office/word/2018/wordml" xmlns:w16du="http://schemas.microsoft.com/office/word/2023/wordml/word16du" xmlns:w16sdtdh="http://schemas.microsoft.com/office/word/2020/wordml/sdtdatahash" xmlns:w16sdtfl="http://schemas.microsoft.com/office/word/2024/wordml/sdtformatlock" xmlns:w16se="http://schemas.microsoft.com/office/word/2015/wordml/symex" xmlns:wpg="http://schemas.microsoft.com/office/word/2010/wordprocessingGroup" xmlns:wpi="http://schemas.microsoft.com/office/word/2010/wordprocessingInk" xmlns:wne="http://schemas.microsoft.com/office/word/2006/wordml" xmlns:wps="http://schemas.microsoft.com/office/word/2010/wordprocessingShape" mc:Ignorable="w14 w15 w16se w16cid w16 w16cex w16sdtdh w16sdtfl w16du wp14">
   <w:endnote w:type="separator" w:id="-1">
     <w:p>
+      <w:pPr>
+        <w:rPr>
+          <w:rFonts w:hint="eastAsia"/>
+        </w:rPr>
+      </w:pPr>
       <w:r>
         <w:separator/>
       </w:r>
@@ -1458,6 +1882,11 @@
   </w:endnote>
   <w:endnote w:type="continuationSeparator" w:id="0">
     <w:p>
+      <w:pPr>
+        <w:rPr>
+          <w:rFonts w:hint="eastAsia"/>
+        </w:rPr>
+      </w:pPr>
       <w:r>
         <w:continuationSeparator/>
       </w:r>
@@ -1467,9 +1896,14 @@
 </file>
 
 <file path=word/footnotes.xml><?xml version="1.0" encoding="utf-8"?>
-<w:footnotes xmlns:wpc="http://schemas.microsoft.com/office/word/2010/wordprocessingCanvas" xmlns:cx="http://schemas.microsoft.com/office/drawing/2014/chartex" xmlns:cx1="http://schemas.microsoft.com/office/drawing/2015/9/8/chartex" xmlns:cx2="http://schemas.microsoft.com/office/drawing/2015/10/21/chartex" xmlns:cx3="http://schemas.microsoft.com/office/drawing/2016/5/9/chartex" xmlns:cx4="http://schemas.microsoft.com/office/drawing/2016/5/10/chartex" xmlns:cx5="http://schemas.microsoft.com/office/drawing/2016/5/11/chartex" xmlns:cx6="http://schemas.microsoft.com/office/drawing/2016/5/12/chartex" xmlns:cx7="http://schemas.microsoft.com/office/drawing/2016/5/13/chartex" xmlns:cx8="http://schemas.microsoft.com/office/drawing/2016/5/14/chartex" xmlns:mc="http://schemas.openxmlformats.org/markup-compatibility/2006" xmlns:aink="http://schemas.microsoft.com/office/drawing/2016/ink" xmlns:am3d="http://schemas.microsoft.com/office/drawing/2017/model3d" xmlns:o="urn:schemas-microsoft-com:office:office" xmlns:r="http://schemas.openxmlformats.org/officeDocument/2006/relationships" xmlns:m="http://schemas.openxmlformats.org/officeDocument/2006/math" xmlns:v="urn:schemas-microsoft-com:vml" xmlns:wp14="http://schemas.microsoft.com/office/word/2010/wordprocessingDrawing" xmlns:wp="http://schemas.openxmlformats.org/drawingml/2006/wordprocessingDrawing" xmlns:w10="urn:schemas-microsoft-com:office:word" xmlns:w="http://schemas.openxmlformats.org/wordprocessingml/2006/main" xmlns:w14="http://schemas.microsoft.com/office/word/2010/wordml" xmlns:w15="http://schemas.microsoft.com/office/word/2012/wordml" xmlns:w16cex="http://schemas.microsoft.com/office/word/2018/wordml/cex" xmlns:w16cid="http://schemas.microsoft.com/office/word/2016/wordml/cid" xmlns:w16="http://schemas.microsoft.com/office/word/2018/wordml" xmlns:w16sdtdh="http://schemas.microsoft.com/office/word/2020/wordml/sdtdatahash" xmlns:w16se="http://schemas.microsoft.com/office/word/2015/wordml/symex" xmlns:wpg="http://schemas.microsoft.com/office/word/2010/wordprocessingGroup" xmlns:wpi="http://schemas.microsoft.com/office/word/2010/wordprocessingInk" xmlns:wne="http://schemas.microsoft.com/office/word/2006/wordml" xmlns:wps="http://schemas.microsoft.com/office/word/2010/wordprocessingShape" mc:Ignorable="w14 w15 w16se w16cid w16 w16cex w16sdtdh wp14">
+<w:footnotes xmlns:wpc="http://schemas.microsoft.com/office/word/2010/wordprocessingCanvas" xmlns:cx="http://schemas.microsoft.com/office/drawing/2014/chartex" xmlns:cx1="http://schemas.microsoft.com/office/drawing/2015/9/8/chartex" xmlns:cx2="http://schemas.microsoft.com/office/drawing/2015/10/21/chartex" xmlns:cx3="http://schemas.microsoft.com/office/drawing/2016/5/9/chartex" xmlns:cx4="http://schemas.microsoft.com/office/drawing/2016/5/10/chartex" xmlns:cx5="http://schemas.microsoft.com/office/drawing/2016/5/11/chartex" xmlns:cx6="http://schemas.microsoft.com/office/drawing/2016/5/12/chartex" xmlns:cx7="http://schemas.microsoft.com/office/drawing/2016/5/13/chartex" xmlns:cx8="http://schemas.microsoft.com/office/drawing/2016/5/14/chartex" xmlns:mc="http://schemas.openxmlformats.org/markup-compatibility/2006" xmlns:aink="http://schemas.microsoft.com/office/drawing/2016/ink" xmlns:am3d="http://schemas.microsoft.com/office/drawing/2017/model3d" xmlns:o="urn:schemas-microsoft-com:office:office" xmlns:oel="http://schemas.microsoft.com/office/2019/extlst" xmlns:r="http://schemas.openxmlformats.org/officeDocument/2006/relationships" xmlns:m="http://schemas.openxmlformats.org/officeDocument/2006/math" xmlns:v="urn:schemas-microsoft-com:vml" xmlns:wp14="http://schemas.microsoft.com/office/word/2010/wordprocessingDrawing" xmlns:wp="http://schemas.openxmlformats.org/drawingml/2006/wordprocessingDrawing" xmlns:w10="urn:schemas-microsoft-com:office:word" xmlns:w="http://schemas.openxmlformats.org/wordprocessingml/2006/main" xmlns:w14="http://schemas.microsoft.com/office/word/2010/wordml" xmlns:w15="http://schemas.microsoft.com/office/word/2012/wordml" xmlns:w16cex="http://schemas.microsoft.com/office/word/2018/wordml/cex" xmlns:w16cid="http://schemas.microsoft.com/office/word/2016/wordml/cid" xmlns:w16="http://schemas.microsoft.com/office/word/2018/wordml" xmlns:w16du="http://schemas.microsoft.com/office/word/2023/wordml/word16du" xmlns:w16sdtdh="http://schemas.microsoft.com/office/word/2020/wordml/sdtdatahash" xmlns:w16sdtfl="http://schemas.microsoft.com/office/word/2024/wordml/sdtformatlock" xmlns:w16se="http://schemas.microsoft.com/office/word/2015/wordml/symex" xmlns:wpg="http://schemas.microsoft.com/office/word/2010/wordprocessingGroup" xmlns:wpi="http://schemas.microsoft.com/office/word/2010/wordprocessingInk" xmlns:wne="http://schemas.microsoft.com/office/word/2006/wordml" xmlns:wps="http://schemas.microsoft.com/office/word/2010/wordprocessingShape" mc:Ignorable="w14 w15 w16se w16cid w16 w16cex w16sdtdh w16sdtfl w16du wp14">
   <w:footnote w:type="separator" w:id="-1">
     <w:p>
+      <w:pPr>
+        <w:rPr>
+          <w:rFonts w:hint="eastAsia"/>
+        </w:rPr>
+      </w:pPr>
       <w:r>
         <w:separator/>
       </w:r>
@@ -1477,6 +1911,11 @@
   </w:footnote>
   <w:footnote w:type="continuationSeparator" w:id="0">
     <w:p>
+      <w:pPr>
+        <w:rPr>
+          <w:rFonts w:hint="eastAsia"/>
+        </w:rPr>
+      </w:pPr>
       <w:r>
         <w:continuationSeparator/>
       </w:r>
@@ -1486,7 +1925,7 @@
 </file>
 
 <file path=word/header1.xml><?xml version="1.0" encoding="utf-8"?>
-<w:hdr xmlns:wpc="http://schemas.microsoft.com/office/word/2010/wordprocessingCanvas" xmlns:cx="http://schemas.microsoft.com/office/drawing/2014/chartex" xmlns:cx1="http://schemas.microsoft.com/office/drawing/2015/9/8/chartex" xmlns:cx2="http://schemas.microsoft.com/office/drawing/2015/10/21/chartex" xmlns:cx3="http://schemas.microsoft.com/office/drawing/2016/5/9/chartex" xmlns:cx4="http://schemas.microsoft.com/office/drawing/2016/5/10/chartex" xmlns:cx5="http://schemas.microsoft.com/office/drawing/2016/5/11/chartex" xmlns:cx6="http://schemas.microsoft.com/office/drawing/2016/5/12/chartex" xmlns:cx7="http://schemas.microsoft.com/office/drawing/2016/5/13/chartex" xmlns:cx8="http://schemas.microsoft.com/office/drawing/2016/5/14/chartex" xmlns:mc="http://schemas.openxmlformats.org/markup-compatibility/2006" xmlns:aink="http://schemas.microsoft.com/office/drawing/2016/ink" xmlns:am3d="http://schemas.microsoft.com/office/drawing/2017/model3d" xmlns:o="urn:schemas-microsoft-com:office:office" xmlns:r="http://schemas.openxmlformats.org/officeDocument/2006/relationships" xmlns:m="http://schemas.openxmlformats.org/officeDocument/2006/math" xmlns:v="urn:schemas-microsoft-com:vml" xmlns:wp14="http://schemas.microsoft.com/office/word/2010/wordprocessingDrawing" xmlns:wp="http://schemas.openxmlformats.org/drawingml/2006/wordprocessingDrawing" xmlns:w10="urn:schemas-microsoft-com:office:word" xmlns:w="http://schemas.openxmlformats.org/wordprocessingml/2006/main" xmlns:w14="http://schemas.microsoft.com/office/word/2010/wordml" xmlns:w15="http://schemas.microsoft.com/office/word/2012/wordml" xmlns:w16cex="http://schemas.microsoft.com/office/word/2018/wordml/cex" xmlns:w16cid="http://schemas.microsoft.com/office/word/2016/wordml/cid" xmlns:w16="http://schemas.microsoft.com/office/word/2018/wordml" xmlns:w16sdtdh="http://schemas.microsoft.com/office/word/2020/wordml/sdtdatahash" xmlns:w16se="http://schemas.microsoft.com/office/word/2015/wordml/symex" xmlns:wpg="http://schemas.microsoft.com/office/word/2010/wordprocessingGroup" xmlns:wpi="http://schemas.microsoft.com/office/word/2010/wordprocessingInk" xmlns:wne="http://schemas.microsoft.com/office/word/2006/wordml" xmlns:wps="http://schemas.microsoft.com/office/word/2010/wordprocessingShape" mc:Ignorable="w14 w15 w16se w16cid w16 w16cex w16sdtdh wp14">
+<w:hdr xmlns:wpc="http://schemas.microsoft.com/office/word/2010/wordprocessingCanvas" xmlns:cx="http://schemas.microsoft.com/office/drawing/2014/chartex" xmlns:cx1="http://schemas.microsoft.com/office/drawing/2015/9/8/chartex" xmlns:cx2="http://schemas.microsoft.com/office/drawing/2015/10/21/chartex" xmlns:cx3="http://schemas.microsoft.com/office/drawing/2016/5/9/chartex" xmlns:cx4="http://schemas.microsoft.com/office/drawing/2016/5/10/chartex" xmlns:cx5="http://schemas.microsoft.com/office/drawing/2016/5/11/chartex" xmlns:cx6="http://schemas.microsoft.com/office/drawing/2016/5/12/chartex" xmlns:cx7="http://schemas.microsoft.com/office/drawing/2016/5/13/chartex" xmlns:cx8="http://schemas.microsoft.com/office/drawing/2016/5/14/chartex" xmlns:mc="http://schemas.openxmlformats.org/markup-compatibility/2006" xmlns:aink="http://schemas.microsoft.com/office/drawing/2016/ink" xmlns:am3d="http://schemas.microsoft.com/office/drawing/2017/model3d" xmlns:o="urn:schemas-microsoft-com:office:office" xmlns:oel="http://schemas.microsoft.com/office/2019/extlst" xmlns:r="http://schemas.openxmlformats.org/officeDocument/2006/relationships" xmlns:m="http://schemas.openxmlformats.org/officeDocument/2006/math" xmlns:v="urn:schemas-microsoft-com:vml" xmlns:wp14="http://schemas.microsoft.com/office/word/2010/wordprocessingDrawing" xmlns:wp="http://schemas.openxmlformats.org/drawingml/2006/wordprocessingDrawing" xmlns:w10="urn:schemas-microsoft-com:office:word" xmlns:w="http://schemas.openxmlformats.org/wordprocessingml/2006/main" xmlns:w14="http://schemas.microsoft.com/office/word/2010/wordml" xmlns:w15="http://schemas.microsoft.com/office/word/2012/wordml" xmlns:w16cex="http://schemas.microsoft.com/office/word/2018/wordml/cex" xmlns:w16cid="http://schemas.microsoft.com/office/word/2016/wordml/cid" xmlns:w16="http://schemas.microsoft.com/office/word/2018/wordml" xmlns:w16du="http://schemas.microsoft.com/office/word/2023/wordml/word16du" xmlns:w16sdtdh="http://schemas.microsoft.com/office/word/2020/wordml/sdtdatahash" xmlns:w16sdtfl="http://schemas.microsoft.com/office/word/2024/wordml/sdtformatlock" xmlns:w16se="http://schemas.microsoft.com/office/word/2015/wordml/symex" xmlns:wpg="http://schemas.microsoft.com/office/word/2010/wordprocessingGroup" xmlns:wpi="http://schemas.microsoft.com/office/word/2010/wordprocessingInk" xmlns:wne="http://schemas.microsoft.com/office/word/2006/wordml" xmlns:wps="http://schemas.microsoft.com/office/word/2010/wordprocessingShape" mc:Ignorable="w14 w15 w16se w16cid w16 w16cex w16sdtdh w16sdtfl w16du wp14">
   <w:p>
     <w:pPr>
       <w:pStyle w:val="a3"/>
@@ -1494,6 +1933,9 @@
         <w:tab w:val="clear" w:pos="4153"/>
       </w:tabs>
       <w:jc w:val="left"/>
+      <w:rPr>
+        <w:rFonts w:hint="eastAsia"/>
+      </w:rPr>
     </w:pPr>
     <w:r>
       <w:rPr>
@@ -1533,7 +1975,7 @@
 </file>
 
 <file path=word/numbering.xml><?xml version="1.0" encoding="utf-8"?>
-<w:numbering xmlns:wpc="http://schemas.microsoft.com/office/word/2010/wordprocessingCanvas" xmlns:cx="http://schemas.microsoft.com/office/drawing/2014/chartex" xmlns:cx1="http://schemas.microsoft.com/office/drawing/2015/9/8/chartex" xmlns:cx2="http://schemas.microsoft.com/office/drawing/2015/10/21/chartex" xmlns:cx3="http://schemas.microsoft.com/office/drawing/2016/5/9/chartex" xmlns:cx4="http://schemas.microsoft.com/office/drawing/2016/5/10/chartex" xmlns:cx5="http://schemas.microsoft.com/office/drawing/2016/5/11/chartex" xmlns:cx6="http://schemas.microsoft.com/office/drawing/2016/5/12/chartex" xmlns:cx7="http://schemas.microsoft.com/office/drawing/2016/5/13/chartex" xmlns:cx8="http://schemas.microsoft.com/office/drawing/2016/5/14/chartex" xmlns:mc="http://schemas.openxmlformats.org/markup-compatibility/2006" xmlns:aink="http://schemas.microsoft.com/office/drawing/2016/ink" xmlns:am3d="http://schemas.microsoft.com/office/drawing/2017/model3d" xmlns:o="urn:schemas-microsoft-com:office:office" xmlns:r="http://schemas.openxmlformats.org/officeDocument/2006/relationships" xmlns:m="http://schemas.openxmlformats.org/officeDocument/2006/math" xmlns:v="urn:schemas-microsoft-com:vml" xmlns:wp14="http://schemas.microsoft.com/office/word/2010/wordprocessingDrawing" xmlns:wp="http://schemas.openxmlformats.org/drawingml/2006/wordprocessingDrawing" xmlns:w10="urn:schemas-microsoft-com:office:word" xmlns:w="http://schemas.openxmlformats.org/wordprocessingml/2006/main" xmlns:w14="http://schemas.microsoft.com/office/word/2010/wordml" xmlns:w15="http://schemas.microsoft.com/office/word/2012/wordml" xmlns:w16cex="http://schemas.microsoft.com/office/word/2018/wordml/cex" xmlns:w16cid="http://schemas.microsoft.com/office/word/2016/wordml/cid" xmlns:w16="http://schemas.microsoft.com/office/word/2018/wordml" xmlns:w16sdtdh="http://schemas.microsoft.com/office/word/2020/wordml/sdtdatahash" xmlns:w16se="http://schemas.microsoft.com/office/word/2015/wordml/symex" xmlns:wpg="http://schemas.microsoft.com/office/word/2010/wordprocessingGroup" xmlns:wpi="http://schemas.microsoft.com/office/word/2010/wordprocessingInk" xmlns:wne="http://schemas.microsoft.com/office/word/2006/wordml" xmlns:wps="http://schemas.microsoft.com/office/word/2010/wordprocessingShape" mc:Ignorable="w14 w15 w16se w16cid w16 w16cex w16sdtdh wp14">
+<w:numbering xmlns:wpc="http://schemas.microsoft.com/office/word/2010/wordprocessingCanvas" xmlns:cx="http://schemas.microsoft.com/office/drawing/2014/chartex" xmlns:cx1="http://schemas.microsoft.com/office/drawing/2015/9/8/chartex" xmlns:cx2="http://schemas.microsoft.com/office/drawing/2015/10/21/chartex" xmlns:cx3="http://schemas.microsoft.com/office/drawing/2016/5/9/chartex" xmlns:cx4="http://schemas.microsoft.com/office/drawing/2016/5/10/chartex" xmlns:cx5="http://schemas.microsoft.com/office/drawing/2016/5/11/chartex" xmlns:cx6="http://schemas.microsoft.com/office/drawing/2016/5/12/chartex" xmlns:cx7="http://schemas.microsoft.com/office/drawing/2016/5/13/chartex" xmlns:cx8="http://schemas.microsoft.com/office/drawing/2016/5/14/chartex" xmlns:mc="http://schemas.openxmlformats.org/markup-compatibility/2006" xmlns:aink="http://schemas.microsoft.com/office/drawing/2016/ink" xmlns:am3d="http://schemas.microsoft.com/office/drawing/2017/model3d" xmlns:o="urn:schemas-microsoft-com:office:office" xmlns:oel="http://schemas.microsoft.com/office/2019/extlst" xmlns:r="http://schemas.openxmlformats.org/officeDocument/2006/relationships" xmlns:m="http://schemas.openxmlformats.org/officeDocument/2006/math" xmlns:v="urn:schemas-microsoft-com:vml" xmlns:wp14="http://schemas.microsoft.com/office/word/2010/wordprocessingDrawing" xmlns:wp="http://schemas.openxmlformats.org/drawingml/2006/wordprocessingDrawing" xmlns:w10="urn:schemas-microsoft-com:office:word" xmlns:w="http://schemas.openxmlformats.org/wordprocessingml/2006/main" xmlns:w14="http://schemas.microsoft.com/office/word/2010/wordml" xmlns:w15="http://schemas.microsoft.com/office/word/2012/wordml" xmlns:w16cex="http://schemas.microsoft.com/office/word/2018/wordml/cex" xmlns:w16cid="http://schemas.microsoft.com/office/word/2016/wordml/cid" xmlns:w16="http://schemas.microsoft.com/office/word/2018/wordml" xmlns:w16du="http://schemas.microsoft.com/office/word/2023/wordml/word16du" xmlns:w16sdtdh="http://schemas.microsoft.com/office/word/2020/wordml/sdtdatahash" xmlns:w16sdtfl="http://schemas.microsoft.com/office/word/2024/wordml/sdtformatlock" xmlns:w16se="http://schemas.microsoft.com/office/word/2015/wordml/symex" xmlns:wpg="http://schemas.microsoft.com/office/word/2010/wordprocessingGroup" xmlns:wpi="http://schemas.microsoft.com/office/word/2010/wordprocessingInk" xmlns:wne="http://schemas.microsoft.com/office/word/2006/wordml" xmlns:wps="http://schemas.microsoft.com/office/word/2010/wordprocessingShape" mc:Ignorable="w14 w15 w16se w16cid w16 w16cex w16sdtdh w16sdtfl w16du wp14">
   <w:abstractNum w:abstractNumId="0" w15:restartNumberingAfterBreak="0">
     <w:nsid w:val="20755F81"/>
     <w:multiLevelType w:val="hybridMultilevel"/>
@@ -1712,17 +2154,17 @@
       </w:pPr>
     </w:lvl>
   </w:abstractNum>
-  <w:num w:numId="1">
+  <w:num w:numId="1" w16cid:durableId="1222057526">
     <w:abstractNumId w:val="1"/>
   </w:num>
-  <w:num w:numId="2">
+  <w:num w:numId="2" w16cid:durableId="1868441288">
     <w:abstractNumId w:val="0"/>
   </w:num>
 </w:numbering>
 </file>
 
 <file path=word/styles.xml><?xml version="1.0" encoding="utf-8"?>
-<w:styles xmlns:mc="http://schemas.openxmlformats.org/markup-compatibility/2006" xmlns:r="http://schemas.openxmlformats.org/officeDocument/2006/relationships" xmlns:w="http://schemas.openxmlformats.org/wordprocessingml/2006/main" xmlns:w14="http://schemas.microsoft.com/office/word/2010/wordml" xmlns:w15="http://schemas.microsoft.com/office/word/2012/wordml" xmlns:w16cex="http://schemas.microsoft.com/office/word/2018/wordml/cex" xmlns:w16cid="http://schemas.microsoft.com/office/word/2016/wordml/cid" xmlns:w16="http://schemas.microsoft.com/office/word/2018/wordml" xmlns:w16sdtdh="http://schemas.microsoft.com/office/word/2020/wordml/sdtdatahash" xmlns:w16se="http://schemas.microsoft.com/office/word/2015/wordml/symex" mc:Ignorable="w14 w15 w16se w16cid w16 w16cex w16sdtdh">
+<w:styles xmlns:mc="http://schemas.openxmlformats.org/markup-compatibility/2006" xmlns:r="http://schemas.openxmlformats.org/officeDocument/2006/relationships" xmlns:w="http://schemas.openxmlformats.org/wordprocessingml/2006/main" xmlns:w14="http://schemas.microsoft.com/office/word/2010/wordml" xmlns:w15="http://schemas.microsoft.com/office/word/2012/wordml" xmlns:w16cex="http://schemas.microsoft.com/office/word/2018/wordml/cex" xmlns:w16cid="http://schemas.microsoft.com/office/word/2016/wordml/cid" xmlns:w16="http://schemas.microsoft.com/office/word/2018/wordml" xmlns:w16du="http://schemas.microsoft.com/office/word/2023/wordml/word16du" xmlns:w16sdtdh="http://schemas.microsoft.com/office/word/2020/wordml/sdtdatahash" xmlns:w16sdtfl="http://schemas.microsoft.com/office/word/2024/wordml/sdtformatlock" xmlns:w16se="http://schemas.microsoft.com/office/word/2015/wordml/symex" mc:Ignorable="w14 w15 w16se w16cid w16 w16cex w16sdtdh w16sdtfl w16du">
   <w:docDefaults>
     <w:rPrDefault>
       <w:rPr>

</xml_diff>